<commit_message>
Add PDF guide, update lab files and user DB
Add a PDF version of the DevSecOps lab guide and refresh related lab assets. Added Guias_de_Laboratorio/Guia_Lab_U3_S9_DevSecOps_Fork.pdf, updated the .docx, and removed the .gitkeep placeholder. Also updated Administracion/Lista_Asistencia_ASS_CRN236396.xlsx and refreshed the devsecops lab users DB (devsecops-lab/app/users.db). These changes publish the guide in PDF form and update attendance and user data for the lab.
</commit_message>
<xml_diff>
--- a/Unidad_3_Seguridad_en_Aplicaciones_y_Datos/Guias_de_Laboratorio/Guia_Lab_U3_S9_DevSecOps_Fork.docx
+++ b/Unidad_3_Seguridad_en_Aplicaciones_y_Datos/Guias_de_Laboratorio/Guia_Lab_U3_S9_DevSecOps_Fork.docx
@@ -23,12 +23,6 @@
         <w:gridCol w:w="9360"/>
       </w:tblGrid>
       <w:tr>
-        <w:tblPrEx>
-          <w:tblCellMar>
-            <w:top w:w="0" w:type="dxa"/>
-            <w:bottom w:w="0" w:type="dxa"/>
-          </w:tblCellMar>
-        </w:tblPrEx>
         <w:tc>
           <w:tcPr>
             <w:tcW w:w="0" w:type="auto"/>
@@ -126,7 +120,11 @@
         </w:pBdr>
         <w:spacing w:after="200"/>
         <w:jc w:val="center"/>
+        <w:rPr>
+          <w:lang w:val="es-MX"/>
+        </w:rPr>
       </w:pPr>
+      <w:proofErr w:type="spellStart"/>
       <w:r>
         <w:rPr>
           <w:i/>
@@ -134,9 +132,35 @@
           <w:color w:val="1A5E36"/>
           <w:sz w:val="26"/>
           <w:szCs w:val="26"/>
+          <w:lang w:val="es-MX"/>
         </w:rPr>
-        <w:t>DevSecOps: Pipeline CI/CD con GitHub Actions</w:t>
+        <w:t>DevSecOps</w:t>
       </w:r>
+      <w:proofErr w:type="spellEnd"/>
+      <w:r>
+        <w:rPr>
+          <w:i/>
+          <w:iCs/>
+          <w:color w:val="1A5E36"/>
+          <w:sz w:val="26"/>
+          <w:szCs w:val="26"/>
+          <w:lang w:val="es-MX"/>
+        </w:rPr>
+        <w:t xml:space="preserve">: Pipeline CI/CD con GitHub </w:t>
+      </w:r>
+      <w:proofErr w:type="spellStart"/>
+      <w:r>
+        <w:rPr>
+          <w:i/>
+          <w:iCs/>
+          <w:color w:val="1A5E36"/>
+          <w:sz w:val="26"/>
+          <w:szCs w:val="26"/>
+          <w:lang w:val="es-MX"/>
+        </w:rPr>
+        <w:t>Actions</w:t>
+      </w:r>
+      <w:proofErr w:type="spellEnd"/>
     </w:p>
     <w:tbl>
       <w:tblPr>
@@ -866,12 +890,6 @@
         <w:gridCol w:w="9360"/>
       </w:tblGrid>
       <w:tr>
-        <w:tblPrEx>
-          <w:tblCellMar>
-            <w:top w:w="0" w:type="dxa"/>
-            <w:bottom w:w="0" w:type="dxa"/>
-          </w:tblCellMar>
-        </w:tblPrEx>
         <w:tc>
           <w:tcPr>
             <w:tcW w:w="0" w:type="auto"/>
@@ -905,12 +923,6 @@
         </w:tc>
       </w:tr>
       <w:tr>
-        <w:tblPrEx>
-          <w:tblCellMar>
-            <w:top w:w="0" w:type="dxa"/>
-            <w:bottom w:w="0" w:type="dxa"/>
-          </w:tblCellMar>
-        </w:tblPrEx>
         <w:tc>
           <w:tcPr>
             <w:tcW w:w="0" w:type="auto"/>
@@ -1064,12 +1076,6 @@
         <w:gridCol w:w="8818"/>
       </w:tblGrid>
       <w:tr>
-        <w:tblPrEx>
-          <w:tblCellMar>
-            <w:top w:w="0" w:type="dxa"/>
-            <w:bottom w:w="0" w:type="dxa"/>
-          </w:tblCellMar>
-        </w:tblPrEx>
         <w:tc>
           <w:tcPr>
             <w:tcW w:w="400" w:type="dxa"/>
@@ -1241,12 +1247,6 @@
         <w:gridCol w:w="8675"/>
       </w:tblGrid>
       <w:tr>
-        <w:tblPrEx>
-          <w:tblCellMar>
-            <w:top w:w="0" w:type="dxa"/>
-            <w:bottom w:w="0" w:type="dxa"/>
-          </w:tblCellMar>
-        </w:tblPrEx>
         <w:tc>
           <w:tcPr>
             <w:tcW w:w="400" w:type="dxa"/>
@@ -1345,54 +1345,6 @@
         </w:tc>
       </w:tr>
     </w:tbl>
-    <w:p>
-      <w:pPr>
-        <w:spacing w:before="100"/>
-        <w:rPr>
-          <w:lang w:val="es-MX"/>
-        </w:rPr>
-      </w:pPr>
-    </w:p>
-    <w:p>
-      <w:pPr>
-        <w:spacing w:before="100"/>
-        <w:rPr>
-          <w:lang w:val="es-MX"/>
-        </w:rPr>
-      </w:pPr>
-    </w:p>
-    <w:p>
-      <w:pPr>
-        <w:spacing w:before="100"/>
-        <w:rPr>
-          <w:lang w:val="es-MX"/>
-        </w:rPr>
-      </w:pPr>
-    </w:p>
-    <w:p>
-      <w:pPr>
-        <w:spacing w:before="100"/>
-        <w:rPr>
-          <w:lang w:val="es-MX"/>
-        </w:rPr>
-      </w:pPr>
-    </w:p>
-    <w:p>
-      <w:pPr>
-        <w:spacing w:before="100"/>
-        <w:rPr>
-          <w:lang w:val="es-MX"/>
-        </w:rPr>
-      </w:pPr>
-    </w:p>
-    <w:p>
-      <w:pPr>
-        <w:spacing w:before="100"/>
-        <w:rPr>
-          <w:lang w:val="es-MX"/>
-        </w:rPr>
-      </w:pPr>
-    </w:p>
     <w:p>
       <w:pPr>
         <w:spacing w:before="100"/>
@@ -1423,12 +1375,6 @@
         <w:gridCol w:w="8560"/>
       </w:tblGrid>
       <w:tr>
-        <w:tblPrEx>
-          <w:tblCellMar>
-            <w:top w:w="0" w:type="dxa"/>
-            <w:bottom w:w="0" w:type="dxa"/>
-          </w:tblCellMar>
-        </w:tblPrEx>
         <w:tc>
           <w:tcPr>
             <w:tcW w:w="800" w:type="dxa"/>
@@ -1459,7 +1405,6 @@
                 <w:sz w:val="16"/>
                 <w:szCs w:val="16"/>
               </w:rPr>
-              <w:lastRenderedPageBreak/>
               <w:t>LAB</w:t>
             </w:r>
           </w:p>
@@ -1576,12 +1521,6 @@
         <w:gridCol w:w="9360"/>
       </w:tblGrid>
       <w:tr>
-        <w:tblPrEx>
-          <w:tblCellMar>
-            <w:top w:w="0" w:type="dxa"/>
-            <w:bottom w:w="0" w:type="dxa"/>
-          </w:tblCellMar>
-        </w:tblPrEx>
         <w:tc>
           <w:tcPr>
             <w:tcW w:w="0" w:type="auto"/>
@@ -1615,6 +1554,7 @@
                 <w:szCs w:val="18"/>
                 <w:lang w:val="es-MX"/>
               </w:rPr>
+              <w:lastRenderedPageBreak/>
               <w:t># Paso 1 — Ir al repositorio del curso en GitHub:</w:t>
             </w:r>
           </w:p>
@@ -2023,20 +1963,14 @@
             </w:r>
           </w:p>
           <w:p>
-            <w:pPr>
-              <w:rPr>
-                <w:lang w:val="es-MX"/>
-              </w:rPr>
-            </w:pPr>
-            <w:r>
-              <w:rPr>
-                <w:rFonts w:ascii="Courier New" w:eastAsia="Courier New" w:hAnsi="Courier New" w:cs="Courier New"/>
-                <w:b/>
-                <w:bCs/>
-                <w:color w:val="6A9955"/>
-                <w:sz w:val="18"/>
-                <w:szCs w:val="18"/>
-                <w:lang w:val="es-MX"/>
+            <w:r>
+              <w:rPr>
+                <w:rFonts w:ascii="Courier New" w:eastAsia="Courier New" w:hAnsi="Courier New" w:cs="Courier New"/>
+                <w:b/>
+                <w:bCs/>
+                <w:color w:val="6A9955"/>
+                <w:sz w:val="18"/>
+                <w:szCs w:val="18"/>
               </w:rPr>
               <w:t>#      "I understand my workflows, go ahead and enable them"</w:t>
             </w:r>
@@ -2167,12 +2101,6 @@
         <w:gridCol w:w="8675"/>
       </w:tblGrid>
       <w:tr>
-        <w:tblPrEx>
-          <w:tblCellMar>
-            <w:top w:w="0" w:type="dxa"/>
-            <w:bottom w:w="0" w:type="dxa"/>
-          </w:tblCellMar>
-        </w:tblPrEx>
         <w:tc>
           <w:tcPr>
             <w:tcW w:w="400" w:type="dxa"/>
@@ -2325,12 +2253,6 @@
         <w:gridCol w:w="8560"/>
       </w:tblGrid>
       <w:tr>
-        <w:tblPrEx>
-          <w:tblCellMar>
-            <w:top w:w="0" w:type="dxa"/>
-            <w:bottom w:w="0" w:type="dxa"/>
-          </w:tblCellMar>
-        </w:tblPrEx>
         <w:tc>
           <w:tcPr>
             <w:tcW w:w="800" w:type="dxa"/>
@@ -2432,6 +2354,22 @@
         </w:tc>
       </w:tr>
     </w:tbl>
+    <w:p>
+      <w:pPr>
+        <w:spacing w:before="60"/>
+        <w:rPr>
+          <w:lang w:val="es-MX"/>
+        </w:rPr>
+      </w:pPr>
+    </w:p>
+    <w:p>
+      <w:pPr>
+        <w:spacing w:before="60"/>
+        <w:rPr>
+          <w:lang w:val="es-MX"/>
+        </w:rPr>
+      </w:pPr>
+    </w:p>
     <w:p>
       <w:pPr>
         <w:spacing w:before="60"/>
@@ -2527,12 +2465,6 @@
         <w:gridCol w:w="9360"/>
       </w:tblGrid>
       <w:tr>
-        <w:tblPrEx>
-          <w:tblCellMar>
-            <w:top w:w="0" w:type="dxa"/>
-            <w:bottom w:w="0" w:type="dxa"/>
-          </w:tblCellMar>
-        </w:tblPrEx>
         <w:tc>
           <w:tcPr>
             <w:tcW w:w="0" w:type="auto"/>
@@ -3096,12 +3028,56 @@
                 <w:lang w:val="es-MX"/>
               </w:rPr>
               <w:t># VULNERABILIDAD 5 — Función read_logs(), endpoint /logs</w:t>
+            </w:r>
+            <w:r>
+              <w:rPr>
+                <w:rFonts w:ascii="Courier New" w:eastAsia="Courier New" w:hAnsi="Courier New" w:cs="Courier New"/>
+                <w:b/>
+                <w:bCs/>
+                <w:color w:val="6A9955"/>
+                <w:sz w:val="18"/>
+                <w:szCs w:val="18"/>
+                <w:lang w:val="es-MX"/>
+              </w:rPr>
               <w:br/>
               <w:t># Tipo: Path Traversal</w:t>
+            </w:r>
+            <w:r>
+              <w:rPr>
+                <w:rFonts w:ascii="Courier New" w:eastAsia="Courier New" w:hAnsi="Courier New" w:cs="Courier New"/>
+                <w:b/>
+                <w:bCs/>
+                <w:color w:val="6A9955"/>
+                <w:sz w:val="18"/>
+                <w:szCs w:val="18"/>
+                <w:lang w:val="es-MX"/>
+              </w:rPr>
               <w:br/>
               <w:t># Qué hace: recibe el nombre de un archivo y lo lee del sistema sin validar ruta</w:t>
+            </w:r>
+            <w:r>
+              <w:rPr>
+                <w:rFonts w:ascii="Courier New" w:eastAsia="Courier New" w:hAnsi="Courier New" w:cs="Courier New"/>
+                <w:b/>
+                <w:bCs/>
+                <w:color w:val="6A9955"/>
+                <w:sz w:val="18"/>
+                <w:szCs w:val="18"/>
+                <w:lang w:val="es-MX"/>
+              </w:rPr>
               <w:br/>
               <w:t># Payload: ?file=../../etc/passwd</w:t>
+            </w:r>
+            <w:r>
+              <w:rPr>
+                <w:rFonts w:ascii="Courier New" w:eastAsia="Courier New" w:hAnsi="Courier New" w:cs="Courier New"/>
+                <w:b/>
+                <w:bCs/>
+                <w:color w:val="6A9955"/>
+                <w:sz w:val="18"/>
+                <w:szCs w:val="18"/>
+                <w:lang w:val="es-MX"/>
+              </w:rPr>
               <w:br/>
               <w:t># Efecto: permite leer archivos arbitrarios del servidor</w:t>
             </w:r>
@@ -3151,12 +3127,6 @@
         <w:gridCol w:w="9360"/>
       </w:tblGrid>
       <w:tr>
-        <w:tblPrEx>
-          <w:tblCellMar>
-            <w:top w:w="0" w:type="dxa"/>
-            <w:bottom w:w="0" w:type="dxa"/>
-          </w:tblCellMar>
-        </w:tblPrEx>
         <w:tc>
           <w:tcPr>
             <w:tcW w:w="0" w:type="auto"/>
@@ -3378,12 +3348,6 @@
         <w:gridCol w:w="8560"/>
       </w:tblGrid>
       <w:tr>
-        <w:tblPrEx>
-          <w:tblCellMar>
-            <w:top w:w="0" w:type="dxa"/>
-            <w:bottom w:w="0" w:type="dxa"/>
-          </w:tblCellMar>
-        </w:tblPrEx>
         <w:tc>
           <w:tcPr>
             <w:tcW w:w="800" w:type="dxa"/>
@@ -3527,12 +3491,6 @@
         <w:gridCol w:w="9360"/>
       </w:tblGrid>
       <w:tr>
-        <w:tblPrEx>
-          <w:tblCellMar>
-            <w:top w:w="0" w:type="dxa"/>
-            <w:bottom w:w="0" w:type="dxa"/>
-          </w:tblCellMar>
-        </w:tblPrEx>
         <w:tc>
           <w:tcPr>
             <w:tcW w:w="0" w:type="auto"/>
@@ -3725,12 +3683,6 @@
         <w:gridCol w:w="9360"/>
       </w:tblGrid>
       <w:tr>
-        <w:tblPrEx>
-          <w:tblCellMar>
-            <w:top w:w="0" w:type="dxa"/>
-            <w:bottom w:w="0" w:type="dxa"/>
-          </w:tblCellMar>
-        </w:tblPrEx>
         <w:tc>
           <w:tcPr>
             <w:tcW w:w="0" w:type="auto"/>
@@ -6119,12 +6071,6 @@
         <w:gridCol w:w="9360"/>
       </w:tblGrid>
       <w:tr>
-        <w:tblPrEx>
-          <w:tblCellMar>
-            <w:top w:w="0" w:type="dxa"/>
-            <w:bottom w:w="0" w:type="dxa"/>
-          </w:tblCellMar>
-        </w:tblPrEx>
         <w:tc>
           <w:tcPr>
             <w:tcW w:w="0" w:type="auto"/>
@@ -6610,17 +6556,63 @@
             </w:r>
           </w:p>
           <w:p>
-            <w:r>
-              <w:rPr>
-                <w:rFonts w:ascii="Courier New" w:eastAsia="Courier New" w:hAnsi="Courier New" w:cs="Courier New"/>
-                <w:b/>
-                <w:bCs/>
-                <w:color w:val="6A9955"/>
-                <w:sz w:val="18"/>
-                <w:szCs w:val="18"/>
-              </w:rPr>
-              <w:t># SAST - Semgrep     → SAST - Semgrep</w:t>
-            </w:r>
+            <w:pPr>
+              <w:rPr>
+                <w:lang w:val="es-MX"/>
+              </w:rPr>
+            </w:pPr>
+            <w:r>
+              <w:rPr>
+                <w:rFonts w:ascii="Courier New" w:eastAsia="Courier New" w:hAnsi="Courier New" w:cs="Courier New"/>
+                <w:b/>
+                <w:bCs/>
+                <w:color w:val="6A9955"/>
+                <w:sz w:val="18"/>
+                <w:szCs w:val="18"/>
+                <w:lang w:val="es-MX"/>
+              </w:rPr>
+              <w:t xml:space="preserve"># SAST - </w:t>
+            </w:r>
+            <w:proofErr w:type="spellStart"/>
+            <w:r>
+              <w:rPr>
+                <w:rFonts w:ascii="Courier New" w:eastAsia="Courier New" w:hAnsi="Courier New" w:cs="Courier New"/>
+                <w:b/>
+                <w:bCs/>
+                <w:color w:val="6A9955"/>
+                <w:sz w:val="18"/>
+                <w:szCs w:val="18"/>
+                <w:lang w:val="es-MX"/>
+              </w:rPr>
+              <w:t>Semgrep</w:t>
+            </w:r>
+            <w:proofErr w:type="spellEnd"/>
+            <w:r>
+              <w:rPr>
+                <w:rFonts w:ascii="Courier New" w:eastAsia="Courier New" w:hAnsi="Courier New" w:cs="Courier New"/>
+                <w:b/>
+                <w:bCs/>
+                <w:color w:val="6A9955"/>
+                <w:sz w:val="18"/>
+                <w:szCs w:val="18"/>
+                <w:lang w:val="es-MX"/>
+              </w:rPr>
+              <w:t xml:space="preserve">     → SAST - </w:t>
+            </w:r>
+            <w:proofErr w:type="spellStart"/>
+            <w:r>
+              <w:rPr>
+                <w:rFonts w:ascii="Courier New" w:eastAsia="Courier New" w:hAnsi="Courier New" w:cs="Courier New"/>
+                <w:b/>
+                <w:bCs/>
+                <w:color w:val="6A9955"/>
+                <w:sz w:val="18"/>
+                <w:szCs w:val="18"/>
+                <w:lang w:val="es-MX"/>
+              </w:rPr>
+              <w:t>Semgrep</w:t>
+            </w:r>
+            <w:proofErr w:type="spellEnd"/>
           </w:p>
           <w:p>
             <w:pPr>
@@ -6729,12 +6721,6 @@
         <w:gridCol w:w="8560"/>
       </w:tblGrid>
       <w:tr>
-        <w:tblPrEx>
-          <w:tblCellMar>
-            <w:top w:w="0" w:type="dxa"/>
-            <w:bottom w:w="0" w:type="dxa"/>
-          </w:tblCellMar>
-        </w:tblPrEx>
         <w:tc>
           <w:tcPr>
             <w:tcW w:w="800" w:type="dxa"/>
@@ -6860,12 +6846,6 @@
         <w:gridCol w:w="9360"/>
       </w:tblGrid>
       <w:tr>
-        <w:tblPrEx>
-          <w:tblCellMar>
-            <w:top w:w="0" w:type="dxa"/>
-            <w:bottom w:w="0" w:type="dxa"/>
-          </w:tblCellMar>
-        </w:tblPrEx>
         <w:tc>
           <w:tcPr>
             <w:tcW w:w="0" w:type="auto"/>
@@ -6994,35 +6974,77 @@
             </w:r>
           </w:p>
           <w:p>
-            <w:pPr>
-              <w:rPr>
-                <w:lang w:val="es-MX"/>
-              </w:rPr>
-            </w:pPr>
-            <w:r>
-              <w:rPr>
-                <w:rFonts w:ascii="Courier New" w:eastAsia="Courier New" w:hAnsi="Courier New" w:cs="Courier New"/>
-                <w:b/>
-                <w:bCs/>
-                <w:color w:val="6A9955"/>
-                <w:sz w:val="18"/>
-                <w:szCs w:val="18"/>
-                <w:lang w:val="es-MX"/>
-              </w:rPr>
-              <w:t>#    Dependabot alerts:           ON</w:t>
-            </w:r>
-          </w:p>
-          <w:p>
-            <w:r>
-              <w:rPr>
-                <w:rFonts w:ascii="Courier New" w:eastAsia="Courier New" w:hAnsi="Courier New" w:cs="Courier New"/>
-                <w:b/>
-                <w:bCs/>
-                <w:color w:val="6A9955"/>
-                <w:sz w:val="18"/>
-                <w:szCs w:val="18"/>
-              </w:rPr>
-              <w:t>#    Dependabot security updates: ON</w:t>
+            <w:r>
+              <w:rPr>
+                <w:rFonts w:ascii="Courier New" w:eastAsia="Courier New" w:hAnsi="Courier New" w:cs="Courier New"/>
+                <w:b/>
+                <w:bCs/>
+                <w:color w:val="6A9955"/>
+                <w:sz w:val="18"/>
+                <w:szCs w:val="18"/>
+              </w:rPr>
+              <w:t xml:space="preserve">#    </w:t>
+            </w:r>
+            <w:proofErr w:type="spellStart"/>
+            <w:r>
+              <w:rPr>
+                <w:rFonts w:ascii="Courier New" w:eastAsia="Courier New" w:hAnsi="Courier New" w:cs="Courier New"/>
+                <w:b/>
+                <w:bCs/>
+                <w:color w:val="6A9955"/>
+                <w:sz w:val="18"/>
+                <w:szCs w:val="18"/>
+              </w:rPr>
+              <w:t>Dependabot</w:t>
+            </w:r>
+            <w:proofErr w:type="spellEnd"/>
+            <w:r>
+              <w:rPr>
+                <w:rFonts w:ascii="Courier New" w:eastAsia="Courier New" w:hAnsi="Courier New" w:cs="Courier New"/>
+                <w:b/>
+                <w:bCs/>
+                <w:color w:val="6A9955"/>
+                <w:sz w:val="18"/>
+                <w:szCs w:val="18"/>
+              </w:rPr>
+              <w:t xml:space="preserve"> alerts:           ON</w:t>
+            </w:r>
+          </w:p>
+          <w:p>
+            <w:r>
+              <w:rPr>
+                <w:rFonts w:ascii="Courier New" w:eastAsia="Courier New" w:hAnsi="Courier New" w:cs="Courier New"/>
+                <w:b/>
+                <w:bCs/>
+                <w:color w:val="6A9955"/>
+                <w:sz w:val="18"/>
+                <w:szCs w:val="18"/>
+              </w:rPr>
+              <w:t xml:space="preserve">#    </w:t>
+            </w:r>
+            <w:proofErr w:type="spellStart"/>
+            <w:r>
+              <w:rPr>
+                <w:rFonts w:ascii="Courier New" w:eastAsia="Courier New" w:hAnsi="Courier New" w:cs="Courier New"/>
+                <w:b/>
+                <w:bCs/>
+                <w:color w:val="6A9955"/>
+                <w:sz w:val="18"/>
+                <w:szCs w:val="18"/>
+              </w:rPr>
+              <w:t>Dependabot</w:t>
+            </w:r>
+            <w:proofErr w:type="spellEnd"/>
+            <w:r>
+              <w:rPr>
+                <w:rFonts w:ascii="Courier New" w:eastAsia="Courier New" w:hAnsi="Courier New" w:cs="Courier New"/>
+                <w:b/>
+                <w:bCs/>
+                <w:color w:val="6A9955"/>
+                <w:sz w:val="18"/>
+                <w:szCs w:val="18"/>
+              </w:rPr>
+              <w:t xml:space="preserve"> security updates: ON</w:t>
             </w:r>
           </w:p>
           <w:p>
@@ -7226,46 +7248,6 @@
         </w:tc>
       </w:tr>
     </w:tbl>
-    <w:p>
-      <w:pPr>
-        <w:spacing w:before="100"/>
-        <w:rPr>
-          <w:lang w:val="es-MX"/>
-        </w:rPr>
-      </w:pPr>
-    </w:p>
-    <w:p>
-      <w:pPr>
-        <w:spacing w:before="100"/>
-        <w:rPr>
-          <w:lang w:val="es-MX"/>
-        </w:rPr>
-      </w:pPr>
-    </w:p>
-    <w:p>
-      <w:pPr>
-        <w:spacing w:before="100"/>
-        <w:rPr>
-          <w:lang w:val="es-MX"/>
-        </w:rPr>
-      </w:pPr>
-    </w:p>
-    <w:p>
-      <w:pPr>
-        <w:spacing w:before="100"/>
-        <w:rPr>
-          <w:lang w:val="es-MX"/>
-        </w:rPr>
-      </w:pPr>
-    </w:p>
-    <w:p>
-      <w:pPr>
-        <w:spacing w:before="100"/>
-        <w:rPr>
-          <w:lang w:val="es-MX"/>
-        </w:rPr>
-      </w:pPr>
-    </w:p>
     <w:p>
       <w:pPr>
         <w:spacing w:before="100"/>
@@ -7304,12 +7286,6 @@
         <w:gridCol w:w="8560"/>
       </w:tblGrid>
       <w:tr>
-        <w:tblPrEx>
-          <w:tblCellMar>
-            <w:top w:w="0" w:type="dxa"/>
-            <w:bottom w:w="0" w:type="dxa"/>
-          </w:tblCellMar>
-        </w:tblPrEx>
         <w:tc>
           <w:tcPr>
             <w:tcW w:w="800" w:type="dxa"/>
@@ -7340,7 +7316,6 @@
                 <w:sz w:val="16"/>
                 <w:szCs w:val="16"/>
               </w:rPr>
-              <w:lastRenderedPageBreak/>
               <w:t>LAB</w:t>
             </w:r>
           </w:p>
@@ -7458,12 +7433,6 @@
         <w:gridCol w:w="9360"/>
       </w:tblGrid>
       <w:tr>
-        <w:tblPrEx>
-          <w:tblCellMar>
-            <w:top w:w="0" w:type="dxa"/>
-            <w:bottom w:w="0" w:type="dxa"/>
-          </w:tblCellMar>
-        </w:tblPrEx>
         <w:tc>
           <w:tcPr>
             <w:tcW w:w="0" w:type="auto"/>
@@ -7937,116 +7906,327 @@
     </w:p>
     <w:p>
       <w:pPr>
-        <w:spacing w:before="60"/>
+        <w:spacing w:after="40"/>
         <w:rPr>
           <w:lang w:val="es-MX"/>
         </w:rPr>
       </w:pPr>
-    </w:p>
-    <w:p>
-      <w:pPr>
-        <w:spacing w:before="60"/>
+      <w:r>
         <w:rPr>
+          <w:b/>
+          <w:bCs/>
+          <w:color w:val="000000"/>
           <w:lang w:val="es-MX"/>
         </w:rPr>
-      </w:pPr>
+        <w:t>Paso 5.2 — Analizar resultados de pip-audit:</w:t>
+      </w:r>
     </w:p>
-    <w:p>
-      <w:pPr>
-        <w:spacing w:before="60"/>
-        <w:rPr>
-          <w:lang w:val="es-MX"/>
-        </w:rPr>
-      </w:pPr>
-    </w:p>
-    <w:p>
-      <w:pPr>
-        <w:spacing w:before="60"/>
-        <w:rPr>
-          <w:lang w:val="es-MX"/>
-        </w:rPr>
-      </w:pPr>
-    </w:p>
-    <w:p>
-      <w:pPr>
-        <w:spacing w:before="60"/>
-        <w:rPr>
-          <w:lang w:val="es-MX"/>
-        </w:rPr>
-      </w:pPr>
-    </w:p>
-    <w:p>
-      <w:pPr>
-        <w:spacing w:before="60"/>
-        <w:rPr>
-          <w:lang w:val="es-MX"/>
-        </w:rPr>
-      </w:pPr>
-    </w:p>
-    <w:p>
-      <w:pPr>
-        <w:spacing w:before="60"/>
-        <w:rPr>
-          <w:lang w:val="es-MX"/>
-        </w:rPr>
-      </w:pPr>
-    </w:p>
-    <w:p>
-      <w:pPr>
-        <w:spacing w:before="60"/>
-        <w:rPr>
-          <w:lang w:val="es-MX"/>
-        </w:rPr>
-      </w:pPr>
-    </w:p>
-    <w:p>
-      <w:pPr>
-        <w:spacing w:before="60"/>
-        <w:rPr>
-          <w:lang w:val="es-MX"/>
-        </w:rPr>
-      </w:pPr>
-    </w:p>
-    <w:p>
-      <w:pPr>
-        <w:spacing w:before="60"/>
-        <w:rPr>
-          <w:lang w:val="es-MX"/>
-        </w:rPr>
-      </w:pPr>
-    </w:p>
-    <w:p>
-      <w:pPr>
-        <w:spacing w:before="60"/>
-        <w:rPr>
-          <w:lang w:val="es-MX"/>
-        </w:rPr>
-      </w:pPr>
-    </w:p>
-    <w:p>
-      <w:pPr>
-        <w:spacing w:before="60"/>
-        <w:rPr>
-          <w:lang w:val="es-MX"/>
-        </w:rPr>
-      </w:pPr>
-    </w:p>
-    <w:p>
-      <w:pPr>
-        <w:spacing w:before="60"/>
-        <w:rPr>
-          <w:lang w:val="es-MX"/>
-        </w:rPr>
-      </w:pPr>
-    </w:p>
-    <w:p>
-      <w:pPr>
-        <w:spacing w:before="60"/>
-        <w:rPr>
-          <w:lang w:val="es-MX"/>
-        </w:rPr>
-      </w:pPr>
-    </w:p>
+    <w:tbl>
+      <w:tblPr>
+        <w:tblW w:w="9360" w:type="dxa"/>
+        <w:tblBorders>
+          <w:top w:val="single" w:sz="4" w:space="0" w:color="auto"/>
+          <w:left w:val="single" w:sz="4" w:space="0" w:color="auto"/>
+          <w:bottom w:val="single" w:sz="4" w:space="0" w:color="auto"/>
+          <w:right w:val="single" w:sz="4" w:space="0" w:color="auto"/>
+          <w:insideH w:val="single" w:sz="4" w:space="0" w:color="auto"/>
+          <w:insideV w:val="single" w:sz="4" w:space="0" w:color="auto"/>
+        </w:tblBorders>
+        <w:tblCellMar>
+          <w:left w:w="10" w:type="dxa"/>
+          <w:right w:w="10" w:type="dxa"/>
+        </w:tblCellMar>
+        <w:tblLook w:val="0000" w:firstRow="0" w:lastRow="0" w:firstColumn="0" w:lastColumn="0" w:noHBand="0" w:noVBand="0"/>
+      </w:tblPr>
+      <w:tblGrid>
+        <w:gridCol w:w="9360"/>
+      </w:tblGrid>
+      <w:tr>
+        <w:tc>
+          <w:tcPr>
+            <w:tcW w:w="0" w:type="auto"/>
+            <w:tcBorders>
+              <w:top w:val="single" w:sz="1" w:space="0" w:color="444444"/>
+              <w:left w:val="single" w:sz="1" w:space="0" w:color="444444"/>
+              <w:bottom w:val="single" w:sz="1" w:space="0" w:color="444444"/>
+              <w:right w:val="single" w:sz="1" w:space="0" w:color="444444"/>
+            </w:tcBorders>
+            <w:shd w:val="clear" w:color="auto" w:fill="1E1E1E"/>
+            <w:tcMar>
+              <w:top w:w="140" w:type="dxa"/>
+              <w:left w:w="200" w:type="dxa"/>
+              <w:bottom w:w="140" w:type="dxa"/>
+              <w:right w:w="200" w:type="dxa"/>
+            </w:tcMar>
+          </w:tcPr>
+          <w:p>
+            <w:pPr>
+              <w:rPr>
+                <w:lang w:val="es-MX"/>
+              </w:rPr>
+            </w:pPr>
+            <w:r>
+              <w:rPr>
+                <w:rFonts w:ascii="Courier New" w:eastAsia="Courier New" w:hAnsi="Courier New" w:cs="Courier New"/>
+                <w:b/>
+                <w:bCs/>
+                <w:color w:val="6A9955"/>
+                <w:sz w:val="18"/>
+                <w:szCs w:val="18"/>
+                <w:lang w:val="es-MX"/>
+              </w:rPr>
+              <w:t># En Actions → workflow → 'SCA - Dependencias y CVEs'</w:t>
+            </w:r>
+          </w:p>
+          <w:p>
+            <w:pPr>
+              <w:rPr>
+                <w:lang w:val="es-MX"/>
+              </w:rPr>
+            </w:pPr>
+            <w:r>
+              <w:rPr>
+                <w:rFonts w:ascii="Courier New" w:eastAsia="Courier New" w:hAnsi="Courier New" w:cs="Courier New"/>
+                <w:b/>
+                <w:bCs/>
+                <w:color w:val="6A9955"/>
+                <w:sz w:val="18"/>
+                <w:szCs w:val="18"/>
+                <w:lang w:val="es-MX"/>
+              </w:rPr>
+              <w:t># También descargar el artifact 'pip-audit-report' para el reporte JSON</w:t>
+            </w:r>
+          </w:p>
+          <w:p>
+            <w:pPr>
+              <w:rPr>
+                <w:lang w:val="es-MX"/>
+              </w:rPr>
+            </w:pPr>
+            <w:r>
+              <w:rPr>
+                <w:rFonts w:ascii="Courier New" w:eastAsia="Courier New" w:hAnsi="Courier New" w:cs="Courier New"/>
+                <w:color w:val="D4D4D4"/>
+                <w:sz w:val="18"/>
+                <w:szCs w:val="18"/>
+                <w:lang w:val="es-MX"/>
+              </w:rPr>
+              <w:t xml:space="preserve"> </w:t>
+            </w:r>
+          </w:p>
+          <w:p>
+            <w:pPr>
+              <w:rPr>
+                <w:lang w:val="es-MX"/>
+              </w:rPr>
+            </w:pPr>
+            <w:r>
+              <w:rPr>
+                <w:rFonts w:ascii="Courier New" w:eastAsia="Courier New" w:hAnsi="Courier New" w:cs="Courier New"/>
+                <w:b/>
+                <w:bCs/>
+                <w:color w:val="6A9955"/>
+                <w:sz w:val="18"/>
+                <w:szCs w:val="18"/>
+                <w:lang w:val="es-MX"/>
+              </w:rPr>
+              <w:t># Para cada CVE detectado, completar:</w:t>
+            </w:r>
+          </w:p>
+          <w:p>
+            <w:pPr>
+              <w:rPr>
+                <w:lang w:val="es-MX"/>
+              </w:rPr>
+            </w:pPr>
+            <w:r>
+              <w:rPr>
+                <w:rFonts w:ascii="Courier New" w:eastAsia="Courier New" w:hAnsi="Courier New" w:cs="Courier New"/>
+                <w:color w:val="D4D4D4"/>
+                <w:sz w:val="18"/>
+                <w:szCs w:val="18"/>
+                <w:lang w:val="es-MX"/>
+              </w:rPr>
+              <w:t xml:space="preserve"> </w:t>
+            </w:r>
+          </w:p>
+          <w:p>
+            <w:pPr>
+              <w:rPr>
+                <w:lang w:val="es-MX"/>
+              </w:rPr>
+            </w:pPr>
+            <w:r>
+              <w:rPr>
+                <w:rFonts w:ascii="Courier New" w:eastAsia="Courier New" w:hAnsi="Courier New" w:cs="Courier New"/>
+                <w:color w:val="D4D4D4"/>
+                <w:sz w:val="18"/>
+                <w:szCs w:val="18"/>
+                <w:lang w:val="es-MX"/>
+              </w:rPr>
+              <w:t>CVE 1:</w:t>
+            </w:r>
+          </w:p>
+          <w:p>
+            <w:pPr>
+              <w:rPr>
+                <w:lang w:val="es-MX"/>
+              </w:rPr>
+            </w:pPr>
+            <w:r>
+              <w:rPr>
+                <w:rFonts w:ascii="Courier New" w:eastAsia="Courier New" w:hAnsi="Courier New" w:cs="Courier New"/>
+                <w:color w:val="D4D4D4"/>
+                <w:sz w:val="18"/>
+                <w:szCs w:val="18"/>
+                <w:lang w:val="es-MX"/>
+              </w:rPr>
+              <w:t xml:space="preserve">  Paquete:          _______________________</w:t>
+            </w:r>
+          </w:p>
+          <w:p>
+            <w:pPr>
+              <w:rPr>
+                <w:lang w:val="es-MX"/>
+              </w:rPr>
+            </w:pPr>
+            <w:r>
+              <w:rPr>
+                <w:rFonts w:ascii="Courier New" w:eastAsia="Courier New" w:hAnsi="Courier New" w:cs="Courier New"/>
+                <w:color w:val="D4D4D4"/>
+                <w:sz w:val="18"/>
+                <w:szCs w:val="18"/>
+                <w:lang w:val="es-MX"/>
+              </w:rPr>
+              <w:t xml:space="preserve">  Version actual:   _______________________</w:t>
+            </w:r>
+          </w:p>
+          <w:p>
+            <w:pPr>
+              <w:rPr>
+                <w:lang w:val="es-MX"/>
+              </w:rPr>
+            </w:pPr>
+            <w:r>
+              <w:rPr>
+                <w:rFonts w:ascii="Courier New" w:eastAsia="Courier New" w:hAnsi="Courier New" w:cs="Courier New"/>
+                <w:color w:val="D4D4D4"/>
+                <w:sz w:val="18"/>
+                <w:szCs w:val="18"/>
+                <w:lang w:val="es-MX"/>
+              </w:rPr>
+              <w:t xml:space="preserve">  CVE ID:           _______________________</w:t>
+            </w:r>
+          </w:p>
+          <w:p>
+            <w:pPr>
+              <w:rPr>
+                <w:lang w:val="es-MX"/>
+              </w:rPr>
+            </w:pPr>
+            <w:r>
+              <w:rPr>
+                <w:rFonts w:ascii="Courier New" w:eastAsia="Courier New" w:hAnsi="Courier New" w:cs="Courier New"/>
+                <w:color w:val="D4D4D4"/>
+                <w:sz w:val="18"/>
+                <w:szCs w:val="18"/>
+                <w:lang w:val="es-MX"/>
+              </w:rPr>
+              <w:t xml:space="preserve">  Severidad CVSS:   _______________________</w:t>
+            </w:r>
+          </w:p>
+          <w:p>
+            <w:pPr>
+              <w:rPr>
+                <w:lang w:val="es-MX"/>
+              </w:rPr>
+            </w:pPr>
+            <w:r>
+              <w:rPr>
+                <w:rFonts w:ascii="Courier New" w:eastAsia="Courier New" w:hAnsi="Courier New" w:cs="Courier New"/>
+                <w:color w:val="D4D4D4"/>
+                <w:sz w:val="18"/>
+                <w:szCs w:val="18"/>
+                <w:lang w:val="es-MX"/>
+              </w:rPr>
+              <w:t xml:space="preserve">  Descripcion:      _______________________</w:t>
+            </w:r>
+          </w:p>
+          <w:p>
+            <w:pPr>
+              <w:rPr>
+                <w:lang w:val="es-MX"/>
+              </w:rPr>
+            </w:pPr>
+            <w:r>
+              <w:rPr>
+                <w:rFonts w:ascii="Courier New" w:eastAsia="Courier New" w:hAnsi="Courier New" w:cs="Courier New"/>
+                <w:color w:val="D4D4D4"/>
+                <w:sz w:val="18"/>
+                <w:szCs w:val="18"/>
+                <w:lang w:val="es-MX"/>
+              </w:rPr>
+              <w:t xml:space="preserve">  Version segura:   _______________________</w:t>
+            </w:r>
+          </w:p>
+          <w:p>
+            <w:pPr>
+              <w:rPr>
+                <w:lang w:val="es-MX"/>
+              </w:rPr>
+            </w:pPr>
+            <w:r>
+              <w:rPr>
+                <w:rFonts w:ascii="Courier New" w:eastAsia="Courier New" w:hAnsi="Courier New" w:cs="Courier New"/>
+                <w:color w:val="D4D4D4"/>
+                <w:sz w:val="18"/>
+                <w:szCs w:val="18"/>
+                <w:lang w:val="es-MX"/>
+              </w:rPr>
+              <w:t xml:space="preserve"> </w:t>
+            </w:r>
+          </w:p>
+          <w:p>
+            <w:pPr>
+              <w:rPr>
+                <w:lang w:val="es-MX"/>
+              </w:rPr>
+            </w:pPr>
+            <w:r>
+              <w:rPr>
+                <w:rFonts w:ascii="Courier New" w:eastAsia="Courier New" w:hAnsi="Courier New" w:cs="Courier New"/>
+                <w:b/>
+                <w:bCs/>
+                <w:color w:val="6A9955"/>
+                <w:sz w:val="18"/>
+                <w:szCs w:val="18"/>
+                <w:lang w:val="es-MX"/>
+              </w:rPr>
+              <w:t># En Dependabot alerts (Security tab) verás las mismas alertas</w:t>
+            </w:r>
+          </w:p>
+          <w:p>
+            <w:pPr>
+              <w:rPr>
+                <w:lang w:val="es-MX"/>
+              </w:rPr>
+            </w:pPr>
+            <w:r>
+              <w:rPr>
+                <w:rFonts w:ascii="Courier New" w:eastAsia="Courier New" w:hAnsi="Courier New" w:cs="Courier New"/>
+                <w:b/>
+                <w:bCs/>
+                <w:color w:val="6A9955"/>
+                <w:sz w:val="18"/>
+                <w:szCs w:val="18"/>
+                <w:lang w:val="es-MX"/>
+              </w:rPr>
+              <w:t># con mas detalle incluyendo el Pull Request sugerido para actualizar</w:t>
+            </w:r>
+          </w:p>
+        </w:tc>
+      </w:tr>
+    </w:tbl>
     <w:p>
       <w:pPr>
         <w:spacing w:before="60"/>
@@ -8086,343 +8266,6 @@
           <w:lang w:val="es-MX"/>
         </w:rPr>
         <w:lastRenderedPageBreak/>
-        <w:t>Paso 5.2 — Analizar resultados de pip-audit:</w:t>
-      </w:r>
-    </w:p>
-    <w:tbl>
-      <w:tblPr>
-        <w:tblW w:w="9360" w:type="dxa"/>
-        <w:tblBorders>
-          <w:top w:val="single" w:sz="4" w:space="0" w:color="auto"/>
-          <w:left w:val="single" w:sz="4" w:space="0" w:color="auto"/>
-          <w:bottom w:val="single" w:sz="4" w:space="0" w:color="auto"/>
-          <w:right w:val="single" w:sz="4" w:space="0" w:color="auto"/>
-          <w:insideH w:val="single" w:sz="4" w:space="0" w:color="auto"/>
-          <w:insideV w:val="single" w:sz="4" w:space="0" w:color="auto"/>
-        </w:tblBorders>
-        <w:tblCellMar>
-          <w:left w:w="10" w:type="dxa"/>
-          <w:right w:w="10" w:type="dxa"/>
-        </w:tblCellMar>
-        <w:tblLook w:val="0000" w:firstRow="0" w:lastRow="0" w:firstColumn="0" w:lastColumn="0" w:noHBand="0" w:noVBand="0"/>
-      </w:tblPr>
-      <w:tblGrid>
-        <w:gridCol w:w="9360"/>
-      </w:tblGrid>
-      <w:tr>
-        <w:tblPrEx>
-          <w:tblCellMar>
-            <w:top w:w="0" w:type="dxa"/>
-            <w:bottom w:w="0" w:type="dxa"/>
-          </w:tblCellMar>
-        </w:tblPrEx>
-        <w:tc>
-          <w:tcPr>
-            <w:tcW w:w="0" w:type="auto"/>
-            <w:tcBorders>
-              <w:top w:val="single" w:sz="1" w:space="0" w:color="444444"/>
-              <w:left w:val="single" w:sz="1" w:space="0" w:color="444444"/>
-              <w:bottom w:val="single" w:sz="1" w:space="0" w:color="444444"/>
-              <w:right w:val="single" w:sz="1" w:space="0" w:color="444444"/>
-            </w:tcBorders>
-            <w:shd w:val="clear" w:color="auto" w:fill="1E1E1E"/>
-            <w:tcMar>
-              <w:top w:w="140" w:type="dxa"/>
-              <w:left w:w="200" w:type="dxa"/>
-              <w:bottom w:w="140" w:type="dxa"/>
-              <w:right w:w="200" w:type="dxa"/>
-            </w:tcMar>
-          </w:tcPr>
-          <w:p>
-            <w:pPr>
-              <w:rPr>
-                <w:lang w:val="es-MX"/>
-              </w:rPr>
-            </w:pPr>
-            <w:r>
-              <w:rPr>
-                <w:rFonts w:ascii="Courier New" w:eastAsia="Courier New" w:hAnsi="Courier New" w:cs="Courier New"/>
-                <w:b/>
-                <w:bCs/>
-                <w:color w:val="6A9955"/>
-                <w:sz w:val="18"/>
-                <w:szCs w:val="18"/>
-                <w:lang w:val="es-MX"/>
-              </w:rPr>
-              <w:t># En Actions → workflow → 'SCA - Dependencias y CVEs'</w:t>
-            </w:r>
-          </w:p>
-          <w:p>
-            <w:pPr>
-              <w:rPr>
-                <w:lang w:val="es-MX"/>
-              </w:rPr>
-            </w:pPr>
-            <w:r>
-              <w:rPr>
-                <w:rFonts w:ascii="Courier New" w:eastAsia="Courier New" w:hAnsi="Courier New" w:cs="Courier New"/>
-                <w:b/>
-                <w:bCs/>
-                <w:color w:val="6A9955"/>
-                <w:sz w:val="18"/>
-                <w:szCs w:val="18"/>
-                <w:lang w:val="es-MX"/>
-              </w:rPr>
-              <w:t># También descargar el artifact 'pip-audit-report' para el reporte JSON</w:t>
-            </w:r>
-          </w:p>
-          <w:p>
-            <w:pPr>
-              <w:rPr>
-                <w:lang w:val="es-MX"/>
-              </w:rPr>
-            </w:pPr>
-            <w:r>
-              <w:rPr>
-                <w:rFonts w:ascii="Courier New" w:eastAsia="Courier New" w:hAnsi="Courier New" w:cs="Courier New"/>
-                <w:color w:val="D4D4D4"/>
-                <w:sz w:val="18"/>
-                <w:szCs w:val="18"/>
-                <w:lang w:val="es-MX"/>
-              </w:rPr>
-              <w:t xml:space="preserve"> </w:t>
-            </w:r>
-          </w:p>
-          <w:p>
-            <w:pPr>
-              <w:rPr>
-                <w:lang w:val="es-MX"/>
-              </w:rPr>
-            </w:pPr>
-            <w:r>
-              <w:rPr>
-                <w:rFonts w:ascii="Courier New" w:eastAsia="Courier New" w:hAnsi="Courier New" w:cs="Courier New"/>
-                <w:b/>
-                <w:bCs/>
-                <w:color w:val="6A9955"/>
-                <w:sz w:val="18"/>
-                <w:szCs w:val="18"/>
-                <w:lang w:val="es-MX"/>
-              </w:rPr>
-              <w:t># Para cada CVE detectado, completar:</w:t>
-            </w:r>
-          </w:p>
-          <w:p>
-            <w:pPr>
-              <w:rPr>
-                <w:lang w:val="es-MX"/>
-              </w:rPr>
-            </w:pPr>
-            <w:r>
-              <w:rPr>
-                <w:rFonts w:ascii="Courier New" w:eastAsia="Courier New" w:hAnsi="Courier New" w:cs="Courier New"/>
-                <w:color w:val="D4D4D4"/>
-                <w:sz w:val="18"/>
-                <w:szCs w:val="18"/>
-                <w:lang w:val="es-MX"/>
-              </w:rPr>
-              <w:t xml:space="preserve"> </w:t>
-            </w:r>
-          </w:p>
-          <w:p>
-            <w:pPr>
-              <w:rPr>
-                <w:lang w:val="es-MX"/>
-              </w:rPr>
-            </w:pPr>
-            <w:r>
-              <w:rPr>
-                <w:rFonts w:ascii="Courier New" w:eastAsia="Courier New" w:hAnsi="Courier New" w:cs="Courier New"/>
-                <w:color w:val="D4D4D4"/>
-                <w:sz w:val="18"/>
-                <w:szCs w:val="18"/>
-                <w:lang w:val="es-MX"/>
-              </w:rPr>
-              <w:t>CVE 1:</w:t>
-            </w:r>
-          </w:p>
-          <w:p>
-            <w:pPr>
-              <w:rPr>
-                <w:lang w:val="es-MX"/>
-              </w:rPr>
-            </w:pPr>
-            <w:r>
-              <w:rPr>
-                <w:rFonts w:ascii="Courier New" w:eastAsia="Courier New" w:hAnsi="Courier New" w:cs="Courier New"/>
-                <w:color w:val="D4D4D4"/>
-                <w:sz w:val="18"/>
-                <w:szCs w:val="18"/>
-                <w:lang w:val="es-MX"/>
-              </w:rPr>
-              <w:t xml:space="preserve">  Paquete:          _______________________</w:t>
-            </w:r>
-          </w:p>
-          <w:p>
-            <w:pPr>
-              <w:rPr>
-                <w:lang w:val="es-MX"/>
-              </w:rPr>
-            </w:pPr>
-            <w:r>
-              <w:rPr>
-                <w:rFonts w:ascii="Courier New" w:eastAsia="Courier New" w:hAnsi="Courier New" w:cs="Courier New"/>
-                <w:color w:val="D4D4D4"/>
-                <w:sz w:val="18"/>
-                <w:szCs w:val="18"/>
-                <w:lang w:val="es-MX"/>
-              </w:rPr>
-              <w:t xml:space="preserve">  Version actual:   _______________________</w:t>
-            </w:r>
-          </w:p>
-          <w:p>
-            <w:pPr>
-              <w:rPr>
-                <w:lang w:val="es-MX"/>
-              </w:rPr>
-            </w:pPr>
-            <w:r>
-              <w:rPr>
-                <w:rFonts w:ascii="Courier New" w:eastAsia="Courier New" w:hAnsi="Courier New" w:cs="Courier New"/>
-                <w:color w:val="D4D4D4"/>
-                <w:sz w:val="18"/>
-                <w:szCs w:val="18"/>
-                <w:lang w:val="es-MX"/>
-              </w:rPr>
-              <w:t xml:space="preserve">  CVE ID:           _______________________</w:t>
-            </w:r>
-          </w:p>
-          <w:p>
-            <w:pPr>
-              <w:rPr>
-                <w:lang w:val="es-MX"/>
-              </w:rPr>
-            </w:pPr>
-            <w:r>
-              <w:rPr>
-                <w:rFonts w:ascii="Courier New" w:eastAsia="Courier New" w:hAnsi="Courier New" w:cs="Courier New"/>
-                <w:color w:val="D4D4D4"/>
-                <w:sz w:val="18"/>
-                <w:szCs w:val="18"/>
-                <w:lang w:val="es-MX"/>
-              </w:rPr>
-              <w:t xml:space="preserve">  Severidad CVSS:   _______________________</w:t>
-            </w:r>
-          </w:p>
-          <w:p>
-            <w:pPr>
-              <w:rPr>
-                <w:lang w:val="es-MX"/>
-              </w:rPr>
-            </w:pPr>
-            <w:r>
-              <w:rPr>
-                <w:rFonts w:ascii="Courier New" w:eastAsia="Courier New" w:hAnsi="Courier New" w:cs="Courier New"/>
-                <w:color w:val="D4D4D4"/>
-                <w:sz w:val="18"/>
-                <w:szCs w:val="18"/>
-                <w:lang w:val="es-MX"/>
-              </w:rPr>
-              <w:t xml:space="preserve">  Descripcion:      _______________________</w:t>
-            </w:r>
-          </w:p>
-          <w:p>
-            <w:pPr>
-              <w:rPr>
-                <w:lang w:val="es-MX"/>
-              </w:rPr>
-            </w:pPr>
-            <w:r>
-              <w:rPr>
-                <w:rFonts w:ascii="Courier New" w:eastAsia="Courier New" w:hAnsi="Courier New" w:cs="Courier New"/>
-                <w:color w:val="D4D4D4"/>
-                <w:sz w:val="18"/>
-                <w:szCs w:val="18"/>
-                <w:lang w:val="es-MX"/>
-              </w:rPr>
-              <w:t xml:space="preserve">  Version segura:   _______________________</w:t>
-            </w:r>
-          </w:p>
-          <w:p>
-            <w:pPr>
-              <w:rPr>
-                <w:lang w:val="es-MX"/>
-              </w:rPr>
-            </w:pPr>
-            <w:r>
-              <w:rPr>
-                <w:rFonts w:ascii="Courier New" w:eastAsia="Courier New" w:hAnsi="Courier New" w:cs="Courier New"/>
-                <w:color w:val="D4D4D4"/>
-                <w:sz w:val="18"/>
-                <w:szCs w:val="18"/>
-                <w:lang w:val="es-MX"/>
-              </w:rPr>
-              <w:t xml:space="preserve"> </w:t>
-            </w:r>
-          </w:p>
-          <w:p>
-            <w:pPr>
-              <w:rPr>
-                <w:lang w:val="es-MX"/>
-              </w:rPr>
-            </w:pPr>
-            <w:r>
-              <w:rPr>
-                <w:rFonts w:ascii="Courier New" w:eastAsia="Courier New" w:hAnsi="Courier New" w:cs="Courier New"/>
-                <w:b/>
-                <w:bCs/>
-                <w:color w:val="6A9955"/>
-                <w:sz w:val="18"/>
-                <w:szCs w:val="18"/>
-                <w:lang w:val="es-MX"/>
-              </w:rPr>
-              <w:t># En Dependabot alerts (Security tab) verás las mismas alertas</w:t>
-            </w:r>
-          </w:p>
-          <w:p>
-            <w:pPr>
-              <w:rPr>
-                <w:lang w:val="es-MX"/>
-              </w:rPr>
-            </w:pPr>
-            <w:r>
-              <w:rPr>
-                <w:rFonts w:ascii="Courier New" w:eastAsia="Courier New" w:hAnsi="Courier New" w:cs="Courier New"/>
-                <w:b/>
-                <w:bCs/>
-                <w:color w:val="6A9955"/>
-                <w:sz w:val="18"/>
-                <w:szCs w:val="18"/>
-                <w:lang w:val="es-MX"/>
-              </w:rPr>
-              <w:t># con mas detalle incluyendo el Pull Request sugerido para actualizar</w:t>
-            </w:r>
-          </w:p>
-        </w:tc>
-      </w:tr>
-    </w:tbl>
-    <w:p>
-      <w:pPr>
-        <w:spacing w:before="60"/>
-        <w:rPr>
-          <w:lang w:val="es-MX"/>
-        </w:rPr>
-      </w:pPr>
-    </w:p>
-    <w:p>
-      <w:pPr>
-        <w:spacing w:after="40"/>
-        <w:rPr>
-          <w:lang w:val="es-MX"/>
-        </w:rPr>
-      </w:pPr>
-      <w:r>
-        <w:rPr>
-          <w:b/>
-          <w:bCs/>
-          <w:color w:val="000000"/>
-          <w:lang w:val="es-MX"/>
-        </w:rPr>
         <w:t>Paso 5.3 — Descargar y revisar los artifacts:</w:t>
       </w:r>
     </w:p>
@@ -8447,12 +8290,6 @@
         <w:gridCol w:w="9360"/>
       </w:tblGrid>
       <w:tr>
-        <w:tblPrEx>
-          <w:tblCellMar>
-            <w:top w:w="0" w:type="dxa"/>
-            <w:bottom w:w="0" w:type="dxa"/>
-          </w:tblCellMar>
-        </w:tblPrEx>
         <w:tc>
           <w:tcPr>
             <w:tcW w:w="0" w:type="auto"/>
@@ -8714,12 +8551,6 @@
         <w:gridCol w:w="9360"/>
       </w:tblGrid>
       <w:tr>
-        <w:tblPrEx>
-          <w:tblCellMar>
-            <w:top w:w="0" w:type="dxa"/>
-            <w:bottom w:w="0" w:type="dxa"/>
-          </w:tblCellMar>
-        </w:tblPrEx>
         <w:tc>
           <w:tcPr>
             <w:tcW w:w="0" w:type="auto"/>
@@ -9020,12 +8851,6 @@
         <w:gridCol w:w="9360"/>
       </w:tblGrid>
       <w:tr>
-        <w:tblPrEx>
-          <w:tblCellMar>
-            <w:top w:w="0" w:type="dxa"/>
-            <w:bottom w:w="0" w:type="dxa"/>
-          </w:tblCellMar>
-        </w:tblPrEx>
         <w:tc>
           <w:tcPr>
             <w:tcW w:w="0" w:type="auto"/>
@@ -9058,12 +8883,6 @@
         </w:tc>
       </w:tr>
       <w:tr>
-        <w:tblPrEx>
-          <w:tblCellMar>
-            <w:top w:w="0" w:type="dxa"/>
-            <w:bottom w:w="0" w:type="dxa"/>
-          </w:tblCellMar>
-        </w:tblPrEx>
         <w:tc>
           <w:tcPr>
             <w:tcW w:w="0" w:type="auto"/>
@@ -9116,7 +8935,14 @@
               <w:rPr>
                 <w:lang w:val="es-MX"/>
               </w:rPr>
-              <w:t>El pipeline esta configurado para mostrar las vulnerabilidades pero sin bloquear el merge (--error esta comentado). En un equipo de desarrollo real, que criterios usarias para decidir que nivel de severidad de Semgrep bloquea el merge automaticamente vs. solo genera una advertencia? Considera el impacto en la velocidad del equipo y el riesgo de security fatigue.</w:t>
+              <w:t xml:space="preserve">El pipeline esta configurado para mostrar las vulnerabilidades pero sin bloquear el merge (--error esta comentado). En un equipo de desarrollo real, que criterios </w:t>
+            </w:r>
+            <w:r>
+              <w:rPr>
+                <w:lang w:val="es-MX"/>
+              </w:rPr>
+              <w:lastRenderedPageBreak/>
+              <w:t>usarias para decidir que nivel de severidad de Semgrep bloquea el merge automaticamente vs. solo genera una advertencia? Considera el impacto en la velocidad del equipo y el riesgo de security fatigue.</w:t>
             </w:r>
           </w:p>
           <w:p>
@@ -9170,12 +8996,6 @@
         <w:gridCol w:w="9360"/>
       </w:tblGrid>
       <w:tr>
-        <w:tblPrEx>
-          <w:tblCellMar>
-            <w:top w:w="0" w:type="dxa"/>
-            <w:bottom w:w="0" w:type="dxa"/>
-          </w:tblCellMar>
-        </w:tblPrEx>
         <w:tc>
           <w:tcPr>
             <w:tcW w:w="0" w:type="auto"/>
@@ -9208,12 +9028,6 @@
         </w:tc>
       </w:tr>
       <w:tr>
-        <w:tblPrEx>
-          <w:tblCellMar>
-            <w:top w:w="0" w:type="dxa"/>
-            <w:bottom w:w="0" w:type="dxa"/>
-          </w:tblCellMar>
-        </w:tblPrEx>
         <w:tc>
           <w:tcPr>
             <w:tcW w:w="0" w:type="auto"/>
@@ -9401,6 +9215,9 @@
     <w:p>
       <w:pPr>
         <w:spacing w:before="60" w:after="60"/>
+        <w:rPr>
+          <w:lang w:val="es-MX"/>
+        </w:rPr>
       </w:pPr>
     </w:p>
     <w:sectPr>
@@ -9493,16 +9310,7 @@
         <w:szCs w:val="18"/>
         <w:lang w:val="es-MX"/>
       </w:rPr>
-      <w:t xml:space="preserve">nidad </w:t>
-    </w:r>
-    <w:r>
-      <w:rPr>
-        <w:color w:val="888888"/>
-        <w:sz w:val="18"/>
-        <w:szCs w:val="18"/>
-        <w:lang w:val="es-MX"/>
-      </w:rPr>
-      <w:t>3</w:t>
+      <w:t>nidad 3</w:t>
     </w:r>
     <w:r>
       <w:rPr>
@@ -10303,6 +10111,7 @@
   <w:style w:type="character" w:default="1" w:styleId="DefaultParagraphFont">
     <w:name w:val="Default Paragraph Font"/>
     <w:uiPriority w:val="1"/>
+    <w:semiHidden/>
     <w:unhideWhenUsed/>
   </w:style>
   <w:style w:type="table" w:default="1" w:styleId="TableNormal">

</xml_diff>